<commit_message>
Presentation: fill the empty space on slides 2, 3, 7, 9, 11 and 12
Icons on the A/B/C cards, a 10x10 grid for the 82% slide, a 0-347 scale for
the guess slide, a larger app screenshot for the demo, and icon cards for the
conclusion. Speaker script updated to match the new notes.

Co-Authored-By: Claude Opus 5.5 <noreply@anthropic.com>
Claude-Session: https://claude.ai/code/session_01NSSQLuCunKxZVNza71ab7L
</commit_message>
<xml_diff>
--- a/presentation/HeatCast_NCR_Speaker_Script.docx
+++ b/presentation/HeatCast_NCR_Speaker_Script.docx
@@ -1108,7 +1108,7 @@
         <w:pStyle w:val="BodyText"/>
       </w:pPr>
       <w:r>
-        <w:t xml:space="preserve">In 2025, for 82 out of every 100 city-days, tomorrow’s level was the same as today’s. So the simplest forecast, copy today, is already right most of the time. We call it the copy-today rule, and the real question of our project is whether machine learning can beat it.</w:t>
+        <w:t xml:space="preserve">Each square here is one percent of the city-days in 2025. In 82 out of every 100, tomorrow’s level was the same as today’s. So the simplest forecast, copy today, is already right most of the time. We call it the copy-today rule, and the real question of our project is whether machine learning can beat it.</w:t>
       </w:r>
     </w:p>
     <w:bookmarkEnd w:id="24"/>
@@ -1340,7 +1340,7 @@
         <w:pStyle w:val="BodyText"/>
       </w:pPr>
       <w:r>
-        <w:t xml:space="preserve">Now the final exam, 2025, which we opened only once. There were 347 Danger days across the 16 cities. How many did our model catch: about 100, about 200 or about 300? Hands up for A… B… C…</w:t>
+        <w:t xml:space="preserve">Now the final exam, 2025, which we opened only once. There were 347 Danger days across the 16 cities. How many did our model catch: about 100, about 200 or about 300? A hint: copying today caught 207. Hands up for A… B… C…</w:t>
       </w:r>
     </w:p>
     <w:bookmarkEnd w:id="30"/>

</xml_diff>

<commit_message>
Presentation: replace the audience questions with explained slides
Slide 2 shows the three ways tomorrow can go instead of asking for a show of
hands, slide 7 labels which mistake is worse instead of a vote, slide 9 shows
Danger days caught by copy-today and the Random Forest instead of a guess, and
the demo uses Manila instead of asking for a city. Speaker script updated.

Co-Authored-By: Claude Opus 5.5 <noreply@anthropic.com>
Claude-Session: https://claude.ai/code/session_01NSSQLuCunKxZVNza71ab7L
</commit_message>
<xml_diff>
--- a/presentation/HeatCast_NCR_Speaker_Script.docx
+++ b/presentation/HeatCast_NCR_Speaker_Script.docx
@@ -274,7 +274,7 @@
               <w:jc w:val="left"/>
             </w:pPr>
             <w:r>
-              <w:t xml:space="preserve">Quick question</w:t>
+              <w:t xml:space="preserve">Our question</w:t>
             </w:r>
           </w:p>
         </w:tc>
@@ -624,7 +624,7 @@
               <w:jc w:val="left"/>
             </w:pPr>
             <w:r>
-              <w:t xml:space="preserve">Your guess</w:t>
+              <w:t xml:space="preserve">Danger days caught</w:t>
             </w:r>
           </w:p>
         </w:tc>
@@ -648,7 +648,7 @@
               <w:jc w:val="left"/>
             </w:pPr>
             <w:r>
-              <w:t xml:space="preserve">20 seconds</w:t>
+              <w:t xml:space="preserve">25 seconds</w:t>
             </w:r>
           </w:p>
         </w:tc>
@@ -909,7 +909,7 @@
         <w:pStyle w:val="BodyText"/>
       </w:pPr>
       <w:r>
-        <w:t xml:space="preserve">Approximate totals: Edrian 3:20, Harry 3:05, Marc 3:15 (each includes about 25 seconds on slide 8 for your own model).</w:t>
+        <w:t xml:space="preserve">Approximate totals: Edrian 3:20, Harry 3:05, Marc 3:20 (each includes about 25 seconds on slide 8 for your own model).</w:t>
       </w:r>
     </w:p>
     <w:bookmarkEnd w:id="20"/>
@@ -967,7 +967,7 @@
         <w:pStyle w:val="Compact"/>
       </w:pPr>
       <w:r>
-        <w:t xml:space="preserve">Decide who counts hands on slides 2, 7 and 9 (the presenter of that slide).</w:t>
+        <w:t xml:space="preserve">Slide 14 is a backup for questions only; stop at slide 13.</w:t>
       </w:r>
     </w:p>
     <w:p>
@@ -979,18 +979,6 @@
         <w:pStyle w:val="Compact"/>
       </w:pPr>
       <w:r>
-        <w:t xml:space="preserve">Slide 14 is a backup for questions only; stop at slide 13.</w:t>
-      </w:r>
-    </w:p>
-    <w:p>
-      <w:pPr>
-        <w:numPr>
-          <w:ilvl w:val="0"/>
-          <w:numId w:val="1001"/>
-        </w:numPr>
-        <w:pStyle w:val="Compact"/>
-      </w:pPr>
-      <w:r>
         <w:t xml:space="preserve">Rehearse once with a timer. If you run long, shorten slide 5 (say only the first two findings) and the demo (skip step 3).</w:t>
       </w:r>
     </w:p>
@@ -1036,17 +1024,17 @@
         <w:pStyle w:val="BodyText"/>
       </w:pPr>
       <w:r>
-        <w:t xml:space="preserve">Good morning. We are Edrian, Harry and Marc, and this is HeatCast NCR. Our question: can machine learning predict tomorrow’s heat level in Metro Manila better than just copying today’s level? Before we answer, a quick question for you.</w:t>
+        <w:t xml:space="preserve">Good morning. We are Edrian, Harry and Marc, and this is HeatCast NCR. Our question: can machine learning predict tomorrow’s heat level in Metro Manila better than just copying today’s level? Let’s start with a simple example.</w:t>
       </w:r>
     </w:p>
     <w:bookmarkEnd w:id="22"/>
-    <w:bookmarkStart w:id="23" w:name="slide-2.-quick-question"/>
+    <w:bookmarkStart w:id="23" w:name="slide-2.-our-question"/>
     <w:p>
       <w:pPr>
         <w:pStyle w:val="Heading2"/>
       </w:pPr>
       <w:r>
-        <w:t xml:space="preserve">Slide 2. Quick question</w:t>
+        <w:t xml:space="preserve">Slide 2. Our question</w:t>
       </w:r>
     </w:p>
     <w:p>
@@ -1072,7 +1060,7 @@
         <w:pStyle w:val="BodyText"/>
       </w:pPr>
       <w:r>
-        <w:t xml:space="preserve">Show of hands. Today Manila’s heat index reached 44 degrees, which is Danger. Tomorrow will be: A, hotter; B, the same level; C, cooler. Who says A? B? C? (Count quickly.) Let’s see how often the same level is right.</w:t>
+        <w:t xml:space="preserve">Here is our question as an example. Today Manila’s heat index reached 44 degrees, which is Danger. Tomorrow can go three ways: hotter, Extreme Danger; the same level, Danger again; or cooler. HeatCast NCR has to pick one of these, for each of the 16 cities, every day. So which one happens most often?</w:t>
       </w:r>
     </w:p>
     <w:bookmarkEnd w:id="23"/>
@@ -1108,7 +1096,7 @@
         <w:pStyle w:val="BodyText"/>
       </w:pPr>
       <w:r>
-        <w:t xml:space="preserve">Each square here is one percent of the city-days in 2025. In 82 out of every 100, tomorrow’s level was the same as today’s. So the simplest forecast, copy today, is already right most of the time. We call it the copy-today rule, and the real question of our project is whether machine learning can beat it.</w:t>
+        <w:t xml:space="preserve">Most often, the same level. Each square here is one percent of the city-days in 2025. In 82 out of every 100, tomorrow’s level was the same as today’s. So the simplest forecast, copy today, is already right most of the time. We call it the copy-today rule, and the real question of our project is whether machine learning can beat it.</w:t>
       </w:r>
     </w:p>
     <w:bookmarkEnd w:id="24"/>
@@ -1252,7 +1240,7 @@
         <w:pStyle w:val="BodyText"/>
       </w:pPr>
       <w:r>
-        <w:t xml:space="preserve">Every forecast makes mistakes, so we had to decide which mistake hurts more. Vote with your hands: A, missing a real Danger day, so nobody prepares; or B, a false alarm, activities are moved for nothing. Who says A? B? We agreed A is worse: a missed Danger day can hurt people, while a false alarm costs a change of plans. That is why our rule asks a model to catch more Danger days first. Keep this in mind for the results.</w:t>
+        <w:t xml:space="preserve">Every forecast is sometimes wrong, and it can be wrong in two ways. One: it misses a real Danger day, so nobody prepares, students play outside at 44 degrees, and someone may get sick. Two: a false alarm, so activities are moved indoors on a day that was not that hot. We decided the first mistake is worse: a missed Danger day can hurt people, while a false alarm only costs a change of plans. That is why our rule asks a model to catch more Danger days first. Keep this in mind for the results.</w:t>
       </w:r>
     </w:p>
     <w:bookmarkEnd w:id="28"/>
@@ -1308,13 +1296,13 @@
       </w:r>
     </w:p>
     <w:bookmarkEnd w:id="29"/>
-    <w:bookmarkStart w:id="30" w:name="slide-9.-your-guess"/>
+    <w:bookmarkStart w:id="30" w:name="slide-9.-danger-days-caught"/>
     <w:p>
       <w:pPr>
         <w:pStyle w:val="Heading2"/>
       </w:pPr>
       <w:r>
-        <w:t xml:space="preserve">Slide 9. Your guess</w:t>
+        <w:t xml:space="preserve">Slide 9. Danger days caught</w:t>
       </w:r>
     </w:p>
     <w:p>
@@ -1332,7 +1320,7 @@
         <w:t xml:space="preserve"> </w:t>
       </w:r>
       <w:r>
-        <w:t xml:space="preserve">· 20 seconds</w:t>
+        <w:t xml:space="preserve">· 25 seconds</w:t>
       </w:r>
     </w:p>
     <w:p>
@@ -1340,7 +1328,7 @@
         <w:pStyle w:val="BodyText"/>
       </w:pPr>
       <w:r>
-        <w:t xml:space="preserve">Now the final exam, 2025, which we opened only once. There were 347 Danger days across the 16 cities. How many did our model catch: about 100, about 200 or about 300? A hint: copying today caught 207. Hands up for A… B… C…</w:t>
+        <w:t xml:space="preserve">Now the final exam, 2025, which we opened only once. There were 347 Danger days across the 16 cities. Copying today warned about 207 of them, 60%. Our Random Forest warned about 293, 84%. That is 86 more Danger days with a warning the day before.</w:t>
       </w:r>
     </w:p>
     <w:bookmarkEnd w:id="30"/>
@@ -1376,7 +1364,7 @@
         <w:pStyle w:val="BodyText"/>
       </w:pPr>
       <w:r>
-        <w:t xml:space="preserve">The answer is C: it caught 293 of the 347 Danger days, 84%. Copying today caught only 207, 60%. The price: when it warned Danger, it was right only 36% of the time, about two false alarms for every real Danger day. And its overall score, 0.61, is below copy-today’s 0.68. Remember our vote: we said missing a Danger day is worse than a false alarm. So it is not a better all-round forecaster, but it is a good early warning. Edrian will show it live.</w:t>
+        <w:t xml:space="preserve">Here is the full picture. Catching 293 Danger days has a price: when it warned Danger, it was right only 36% of the time, about two false alarms for every real Danger day. And its overall score, 0.61, is below copy-today’s 0.68. Remember our choice: we said missing a Danger day is worse than a false alarm. So it is not a better all-round forecaster, but it is a good early warning. Edrian will show it live.</w:t>
       </w:r>
     </w:p>
     <w:bookmarkEnd w:id="31"/>
@@ -1420,7 +1408,7 @@
         <w:pStyle w:val="BodyText"/>
       </w:pPr>
       <w:r>
-        <w:t xml:space="preserve">Let’s try it. Can someone pick a city? (Choose it at the top; the city lights up blue on the map.) Let’s say today was very hot there: heat index 45.5, lowest temperature 29, rain 0, pressure 1008, sunshine 7000. Click the button. It predicts the level for tomorrow with the probability of each level, and the city takes that level’s colour on the map. It also reminds users it is a decision aid, not a PAGASA advisory. Now a mistake on purpose: rain of minus 5. The app refuses it and shows the accepted range. And if we clear the form and click, it names every missing value instead of guessing. This is the same saved model that took the final exam, and the input checks are covered by 51 automated tests.</w:t>
+        <w:t xml:space="preserve">Let’s try it with Manila. (Choose it at the top; the city lights up blue on the map.) Say today was very hot there: heat index 45.5, lowest temperature 29, rain 0, pressure 1008, sunshine 7000. Click the button. It predicts the level for tomorrow with the probability of each level, and the city takes that level’s colour on the map. It also reminds users it is a decision aid, not a PAGASA advisory. Now a mistake on purpose: rain of minus 5. The app refuses it and shows the accepted range. And if we clear the form and click, it names every missing value instead of guessing. This is the same saved model that took the final exam, and the input checks are covered by 51 automated tests.</w:t>
       </w:r>
     </w:p>
     <w:bookmarkEnd w:id="32"/>

</xml_diff>